<commit_message>
created the transform  python file and transformed the data
</commit_message>
<xml_diff>
--- a/Directions before  the final output.docx
+++ b/Directions before  the final output.docx
@@ -12,15 +12,7 @@
       </w:r>
       <w:proofErr w:type="spellEnd"/>
       <w:r>
-        <w:t xml:space="preserve"> in e </w:t>
-      </w:r>
-      <w:proofErr w:type="gramStart"/>
-      <w:r>
-        <w:t>commerce  of</w:t>
-      </w:r>
-      <w:proofErr w:type="gramEnd"/>
-      <w:r>
-        <w:t xml:space="preserve"> data engineering </w:t>
+        <w:t xml:space="preserve"> in e commerce  of data engineering </w:t>
       </w:r>
     </w:p>
     <w:p>
@@ -162,6 +154,342 @@
     <w:p>
       <w:r>
         <w:t>Power BI Dashboard</w:t>
+      </w:r>
+    </w:p>
+    <w:p>
+      <w:r>
+        <w:t>1. Download data</w:t>
+      </w:r>
+    </w:p>
+    <w:p>
+      <w:r>
+        <w:t xml:space="preserve">        │</w:t>
+      </w:r>
+    </w:p>
+    <w:p>
+      <w:r>
+        <w:t xml:space="preserve">        </w:t>
+      </w:r>
+      <w:r>
+        <w:rPr>
+          <w:rFonts w:ascii="Arial" w:hAnsi="Arial" w:cs="Arial"/>
+        </w:rPr>
+        <w:t>▼</w:t>
+      </w:r>
+    </w:p>
+    <w:p>
+      <w:r>
+        <w:t>2. Extract ZIP</w:t>
+      </w:r>
+    </w:p>
+    <w:p>
+      <w:r>
+        <w:t xml:space="preserve">        │</w:t>
+      </w:r>
+    </w:p>
+    <w:p>
+      <w:r>
+        <w:lastRenderedPageBreak/>
+        <w:t xml:space="preserve">        </w:t>
+      </w:r>
+      <w:r>
+        <w:rPr>
+          <w:rFonts w:ascii="Arial" w:hAnsi="Arial" w:cs="Arial"/>
+        </w:rPr>
+        <w:t>▼</w:t>
+      </w:r>
+    </w:p>
+    <w:p>
+      <w:r>
+        <w:t>3. Profile the data</w:t>
+      </w:r>
+    </w:p>
+    <w:p>
+      <w:r>
+        <w:t xml:space="preserve">        │</w:t>
+      </w:r>
+    </w:p>
+    <w:p>
+      <w:r>
+        <w:t xml:space="preserve">        </w:t>
+      </w:r>
+      <w:r>
+        <w:rPr>
+          <w:rFonts w:ascii="Arial" w:hAnsi="Arial" w:cs="Arial"/>
+        </w:rPr>
+        <w:t>▼</w:t>
+      </w:r>
+    </w:p>
+    <w:p>
+      <w:r>
+        <w:t>4. Clean the data</w:t>
+      </w:r>
+    </w:p>
+    <w:p>
+      <w:r>
+        <w:t xml:space="preserve">        │</w:t>
+      </w:r>
+    </w:p>
+    <w:p>
+      <w:r>
+        <w:t xml:space="preserve">        </w:t>
+      </w:r>
+      <w:r>
+        <w:rPr>
+          <w:rFonts w:ascii="Arial" w:hAnsi="Arial" w:cs="Arial"/>
+        </w:rPr>
+        <w:t>▼</w:t>
+      </w:r>
+    </w:p>
+    <w:p>
+      <w:r>
+        <w:t>5. Validate the data</w:t>
+      </w:r>
+    </w:p>
+    <w:p>
+      <w:r>
+        <w:t xml:space="preserve">        │</w:t>
+      </w:r>
+    </w:p>
+    <w:p>
+      <w:r>
+        <w:t xml:space="preserve">        </w:t>
+      </w:r>
+      <w:r>
+        <w:rPr>
+          <w:rFonts w:ascii="Arial" w:hAnsi="Arial" w:cs="Arial"/>
+        </w:rPr>
+        <w:t>▼</w:t>
+      </w:r>
+    </w:p>
+    <w:p>
+      <w:r>
+        <w:t>6. Load into PostgreSQL</w:t>
+      </w:r>
+    </w:p>
+    <w:p>
+      <w:r>
+        <w:t xml:space="preserve">        │</w:t>
+      </w:r>
+    </w:p>
+    <w:p>
+      <w:r>
+        <w:t xml:space="preserve">        </w:t>
+      </w:r>
+      <w:r>
+        <w:rPr>
+          <w:rFonts w:ascii="Arial" w:hAnsi="Arial" w:cs="Arial"/>
+        </w:rPr>
+        <w:t>▼</w:t>
+      </w:r>
+    </w:p>
+    <w:p>
+      <w:r>
+        <w:t>7. Build warehouse tables</w:t>
+      </w:r>
+    </w:p>
+    <w:p>
+      <w:r>
+        <w:t xml:space="preserve">        │</w:t>
+      </w:r>
+    </w:p>
+    <w:p>
+      <w:r>
+        <w:t xml:space="preserve">        </w:t>
+      </w:r>
+      <w:r>
+        <w:rPr>
+          <w:rFonts w:ascii="Arial" w:hAnsi="Arial" w:cs="Arial"/>
+        </w:rPr>
+        <w:t>▼</w:t>
+      </w:r>
+    </w:p>
+    <w:p>
+      <w:r>
+        <w:t>8. Automate with Airflow</w:t>
+      </w:r>
+    </w:p>
+    <w:p>
+      <w:r>
+        <w:t xml:space="preserve">        │</w:t>
+      </w:r>
+    </w:p>
+    <w:p>
+      <w:r>
+        <w:t xml:space="preserve">        </w:t>
+      </w:r>
+      <w:r>
+        <w:rPr>
+          <w:rFonts w:ascii="Arial" w:hAnsi="Arial" w:cs="Arial"/>
+        </w:rPr>
+        <w:t>▼</w:t>
+      </w:r>
+    </w:p>
+    <w:p>
+      <w:r>
+        <w:t>9. Stream updates with Kafka</w:t>
+      </w:r>
+    </w:p>
+    <w:p>
+      <w:r>
+        <w:t xml:space="preserve">        │</w:t>
+      </w:r>
+    </w:p>
+    <w:p>
+      <w:r>
+        <w:t xml:space="preserve">        </w:t>
+      </w:r>
+      <w:r>
+        <w:rPr>
+          <w:rFonts w:ascii="Arial" w:hAnsi="Arial" w:cs="Arial"/>
+        </w:rPr>
+        <w:t>▼</w:t>
+      </w:r>
+    </w:p>
+    <w:p>
+      <w:r>
+        <w:t>10. Build dashboards</w:t>
+      </w:r>
+    </w:p>
+    <w:p>
+      <w:r>
+        <w:t xml:space="preserve">Download Data        </w:t>
+      </w:r>
+      <w:r>
+        <w:rPr>
+          <w:rFonts w:ascii="Segoe UI Emoji" w:hAnsi="Segoe UI Emoji" w:cs="Segoe UI Emoji"/>
+        </w:rPr>
+        <w:t>✅</w:t>
+      </w:r>
+    </w:p>
+    <w:p>
+      <w:r>
+        <w:t xml:space="preserve">        │</w:t>
+      </w:r>
+    </w:p>
+    <w:p>
+      <w:r>
+        <w:t xml:space="preserve">Extract ZIP          </w:t>
+      </w:r>
+      <w:r>
+        <w:rPr>
+          <w:rFonts w:ascii="Segoe UI Emoji" w:hAnsi="Segoe UI Emoji" w:cs="Segoe UI Emoji"/>
+        </w:rPr>
+        <w:t>✅</w:t>
+      </w:r>
+    </w:p>
+    <w:p>
+      <w:r>
+        <w:lastRenderedPageBreak/>
+        <w:t xml:space="preserve">        │</w:t>
+      </w:r>
+    </w:p>
+    <w:p>
+      <w:r>
+        <w:t xml:space="preserve">Inspect Dataset      </w:t>
+      </w:r>
+      <w:r>
+        <w:rPr>
+          <w:rFonts w:ascii="Segoe UI Emoji" w:hAnsi="Segoe UI Emoji" w:cs="Segoe UI Emoji"/>
+        </w:rPr>
+        <w:t>✅</w:t>
+      </w:r>
+    </w:p>
+    <w:p>
+      <w:r>
+        <w:t xml:space="preserve">        │</w:t>
+      </w:r>
+    </w:p>
+    <w:p>
+      <w:r>
+        <w:t xml:space="preserve">Profile Dataset      </w:t>
+      </w:r>
+      <w:r>
+        <w:rPr>
+          <w:rFonts w:ascii="Segoe UI Emoji" w:hAnsi="Segoe UI Emoji" w:cs="Segoe UI Emoji"/>
+        </w:rPr>
+        <w:t>✅</w:t>
+      </w:r>
+    </w:p>
+    <w:p>
+      <w:r>
+        <w:t xml:space="preserve">        │</w:t>
+      </w:r>
+    </w:p>
+    <w:p>
+      <w:r>
+        <w:t xml:space="preserve">Transform Data       </w:t>
+      </w:r>
+      <w:r>
+        <w:rPr>
+          <w:rFonts w:ascii="Segoe UI Emoji" w:hAnsi="Segoe UI Emoji" w:cs="Segoe UI Emoji"/>
+        </w:rPr>
+        <w:t>⬅️</w:t>
+      </w:r>
+      <w:r>
+        <w:t xml:space="preserve"> NEXT</w:t>
+      </w:r>
+    </w:p>
+    <w:p>
+      <w:r>
+        <w:t xml:space="preserve">        │</w:t>
+      </w:r>
+    </w:p>
+    <w:p>
+      <w:r>
+        <w:t>Validate Data</w:t>
+      </w:r>
+    </w:p>
+    <w:p>
+      <w:r>
+        <w:t xml:space="preserve">        │</w:t>
+      </w:r>
+    </w:p>
+    <w:p>
+      <w:r>
+        <w:t>Load to PostgreSQL</w:t>
+      </w:r>
+    </w:p>
+    <w:p>
+      <w:r>
+        <w:t xml:space="preserve">        │</w:t>
+      </w:r>
+    </w:p>
+    <w:p>
+      <w:r>
+        <w:t>Kafka</w:t>
+      </w:r>
+    </w:p>
+    <w:p>
+      <w:r>
+        <w:t xml:space="preserve">        │</w:t>
+      </w:r>
+    </w:p>
+    <w:p>
+      <w:r>
+        <w:t>Airflow</w:t>
+      </w:r>
+    </w:p>
+    <w:p>
+      <w:r>
+        <w:t xml:space="preserve">        │</w:t>
+      </w:r>
+    </w:p>
+    <w:p>
+      <w:proofErr w:type="spellStart"/>
+      <w:r>
+        <w:t>dbt</w:t>
+      </w:r>
+      <w:proofErr w:type="spellEnd"/>
+    </w:p>
+    <w:p>
+      <w:r>
+        <w:t xml:space="preserve">        │</w:t>
+      </w:r>
+    </w:p>
+    <w:p>
+      <w:r>
+        <w:t>Power BI</w:t>
       </w:r>
     </w:p>
     <w:sectPr>

</xml_diff>